<commit_message>
Add live proof matrix and Palantir packet
</commit_message>
<xml_diff>
--- a/public/resume/Doeon_Kim_Resume_LLM_Systems_Engineer.docx
+++ b/public/resume/Doeon_Kim_Resume_LLM_Systems_Engineer.docx
@@ -67,7 +67,7 @@
           <w:rFonts w:ascii="Arial" w:hAnsi="Arial"/>
           <w:sz w:val="18"/>
         </w:rPr>
-        <w:t>Improved StagePilot benchmark success from 29.17% baseline to 87.50% with parser recovery and to 100.00% with bounded retry plus explicit failure-taxonomy and protocol-matrix surfaces.</w:t>
+        <w:t>Improved StagePilot benchmark success from 29.17% baseline to 87.50% with parser recovery and to 100.00% with bounded retry, then exposed the same runtime story through live-review, trace-observability, and regression-gate surfaces.</w:t>
       </w:r>
     </w:p>
     <w:p>
@@ -79,7 +79,7 @@
           <w:rFonts w:ascii="Arial" w:hAnsi="Arial"/>
           <w:sz w:val="18"/>
         </w:rPr>
-        <w:t>Extends the same reliability mindset into multimodal incident review, air-gapped operations, and governance-heavy enterprise delivery.</w:t>
+        <w:t>Extends the same reliability mindset into multimodal incident review, live escalation preview, air-gapped operations, and governance-heavy enterprise delivery.</w:t>
       </w:r>
     </w:p>
     <w:p>
@@ -323,7 +323,7 @@
         <w:pStyle w:val="ListBullet"/>
       </w:pPr>
       <w:r>
-        <w:t>Added failure-taxonomy and protocol-matrix review APIs so parser drift, retries, and cross-protocol behavior stay inspectable.</w:t>
+        <w:t>Added live-review, failure-taxonomy, trace-observability, regression-gate, and protocol-matrix APIs so parser drift, retries, and cross-protocol behavior stay inspectable.</w:t>
       </w:r>
     </w:p>
     <w:p>
@@ -358,7 +358,7 @@
         <w:pStyle w:val="ListBullet"/>
       </w:pPr>
       <w:r>
-        <w:t>Added JSON/schema guardrails, BYOK and no-key modes, plus postmortem-pack and escalation-readiness surfaces for reviewable incident handoff.</w:t>
+        <w:t>Added JSON/schema guardrails, BYOK and no-key modes, plus postmortem-pack, escalation-readiness, and live-escalation-preview surfaces for reviewable incident handoff.</w:t>
       </w:r>
     </w:p>
     <w:p>

</xml_diff>

<commit_message>
Add project status matrix
</commit_message>
<xml_diff>
--- a/public/resume/Doeon_Kim_Resume_LLM_Systems_Engineer.docx
+++ b/public/resume/Doeon_Kim_Resume_LLM_Systems_Engineer.docx
@@ -67,7 +67,7 @@
           <w:rFonts w:ascii="Arial" w:hAnsi="Arial"/>
           <w:sz w:val="18"/>
         </w:rPr>
-        <w:t>Improved StagePilot benchmark success from 29.17% baseline to 87.50% with parser recovery and to 100.00% with bounded retry plus explicit failure-taxonomy and protocol-matrix surfaces.</w:t>
+        <w:t>Improved StagePilot benchmark success from 29.17% baseline to 87.50% with parser recovery and to 100.00% with bounded retry, then exposed the same runtime story through live-review, trace-observability, and regression-gate surfaces.</w:t>
       </w:r>
     </w:p>
     <w:p>
@@ -79,7 +79,7 @@
           <w:rFonts w:ascii="Arial" w:hAnsi="Arial"/>
           <w:sz w:val="18"/>
         </w:rPr>
-        <w:t>Extends the same reliability mindset into multimodal incident review, air-gapped operations, and governance-heavy enterprise delivery.</w:t>
+        <w:t>Extends the same reliability mindset into multimodal incident review, live escalation preview, air-gapped operations, and governance-heavy enterprise delivery.</w:t>
       </w:r>
     </w:p>
     <w:p>
@@ -323,7 +323,7 @@
         <w:pStyle w:val="ListBullet"/>
       </w:pPr>
       <w:r>
-        <w:t>Added failure-taxonomy and protocol-matrix review APIs so parser drift, retries, and cross-protocol behavior stay inspectable.</w:t>
+        <w:t>Added live-review, failure-taxonomy, trace-observability, regression-gate, and protocol-matrix APIs so parser drift, retries, and cross-protocol behavior stay inspectable.</w:t>
       </w:r>
     </w:p>
     <w:p>
@@ -358,7 +358,7 @@
         <w:pStyle w:val="ListBullet"/>
       </w:pPr>
       <w:r>
-        <w:t>Added JSON/schema guardrails, BYOK and no-key modes, plus postmortem-pack and escalation-readiness surfaces for reviewable incident handoff.</w:t>
+        <w:t>Added JSON/schema guardrails, BYOK and no-key modes, plus postmortem-pack, escalation-readiness, and live-escalation-preview surfaces for reviewable incident handoff.</w:t>
       </w:r>
     </w:p>
     <w:p>

</xml_diff>

<commit_message>
Refine portfolio hiring narrative
</commit_message>
<xml_diff>
--- a/public/resume/Doeon_Kim_Resume_LLM_Systems_Engineer.docx
+++ b/public/resume/Doeon_Kim_Resume_LLM_Systems_Engineer.docx
@@ -17,7 +17,7 @@
         <w:jc w:val="center"/>
       </w:pPr>
       <w:r>
-        <w:t>LLM Systems Engineer | Agent Reliability, Evals, Runtime Safety</w:t>
+        <w:t>AI Systems Engineer | Reliability, Evaluation, Runtime Delivery</w:t>
       </w:r>
     </w:p>
     <w:p>
@@ -55,7 +55,7 @@
           <w:rFonts w:ascii="Arial" w:hAnsi="Arial"/>
           <w:sz w:val="18"/>
         </w:rPr>
-        <w:t>Builds reviewable LLM runtimes with strongest public proof in tool-calling reliability, multimodal incident AI, and operator-safe runtime design.</w:t>
+        <w:t>Builds production-minded AI systems with strongest public proof in tool-calling reliability, multimodal incident workflows, and reviewable runtime design.</w:t>
       </w:r>
     </w:p>
     <w:p>
@@ -67,7 +67,7 @@
           <w:rFonts w:ascii="Arial" w:hAnsi="Arial"/>
           <w:sz w:val="18"/>
         </w:rPr>
-        <w:t>Improved StagePilot benchmark success from 29.17% baseline to 87.50% with parser recovery and to 100.00% with bounded retry, then exposed the same runtime story through live-review, trace-observability, and regression-gate surfaces.</w:t>
+        <w:t>Improved StagePilot benchmark success from 29.17% baseline to 87.50% with parser recovery and to 100.00% with bounded retry, then exposed the same runtime story through live review, trace observability, and regression-gate surfaces.</w:t>
       </w:r>
     </w:p>
     <w:p>
@@ -79,7 +79,7 @@
           <w:rFonts w:ascii="Arial" w:hAnsi="Arial"/>
           <w:sz w:val="18"/>
         </w:rPr>
-        <w:t>Extends the same review-safe reliability posture into bounded live reviewer APIs for multimodal incident review, governed analytics, document QA, air-gapped operations, and high-trust workflow delivery.</w:t>
+        <w:t>Extends the same reliability posture into bounded live reviewer APIs for incident review, governed analytics, document QA, air-gapped operations, and high-trust workflow delivery.</w:t>
       </w:r>
     </w:p>
     <w:p>

</xml_diff>

<commit_message>
Update about section copy
</commit_message>
<xml_diff>
--- a/public/resume/Doeon_Kim_Resume_LLM_Systems_Engineer.docx
+++ b/public/resume/Doeon_Kim_Resume_LLM_Systems_Engineer.docx
@@ -17,7 +17,7 @@
         <w:jc w:val="center"/>
       </w:pPr>
       <w:r>
-        <w:t>LLM Systems Engineer | Agent Reliability, Evals, Runtime Safety</w:t>
+        <w:t>AI Systems Engineer | Reliability, Evaluation, Runtime Delivery</w:t>
       </w:r>
     </w:p>
     <w:p>
@@ -55,7 +55,7 @@
           <w:rFonts w:ascii="Arial" w:hAnsi="Arial"/>
           <w:sz w:val="18"/>
         </w:rPr>
-        <w:t>Builds reviewable LLM runtimes with strongest public proof in tool-calling reliability, multimodal incident AI, and operator-safe runtime design.</w:t>
+        <w:t>Builds production-minded AI systems with strongest public proof in tool-calling reliability, multimodal incident workflows, and reviewable runtime design.</w:t>
       </w:r>
     </w:p>
     <w:p>
@@ -67,7 +67,7 @@
           <w:rFonts w:ascii="Arial" w:hAnsi="Arial"/>
           <w:sz w:val="18"/>
         </w:rPr>
-        <w:t>Improved StagePilot benchmark success from 29.17% baseline to 87.50% with parser recovery and to 100.00% with bounded retry, then exposed the same runtime story through live-review, trace-observability, and regression-gate surfaces.</w:t>
+        <w:t>Improved StagePilot benchmark success from 29.17% baseline to 87.50% with parser recovery and to 100.00% with bounded retry, then exposed the same runtime story through live review, trace observability, and regression-gate surfaces.</w:t>
       </w:r>
     </w:p>
     <w:p>
@@ -79,7 +79,7 @@
           <w:rFonts w:ascii="Arial" w:hAnsi="Arial"/>
           <w:sz w:val="18"/>
         </w:rPr>
-        <w:t>Extends the same review-safe reliability posture into bounded live reviewer APIs for multimodal incident review, governed analytics, document QA, air-gapped operations, and high-trust workflow delivery.</w:t>
+        <w:t>Extends the same reliability posture into bounded live reviewer APIs for incident review, governed analytics, document QA, air-gapped operations, and high-trust workflow delivery.</w:t>
       </w:r>
     </w:p>
     <w:p>

</xml_diff>

<commit_message>
Refresh portfolio proof and resume artifacts
</commit_message>
<xml_diff>
--- a/public/resume/Doeon_Kim_Resume_LLM_Systems_Engineer.docx
+++ b/public/resume/Doeon_Kim_Resume_LLM_Systems_Engineer.docx
@@ -67,7 +67,7 @@
           <w:rFonts w:ascii="Arial" w:hAnsi="Arial"/>
           <w:sz w:val="18"/>
         </w:rPr>
-        <w:t>Improved StagePilot benchmark success from 29.17% baseline to 87.50% with parser recovery and to 100.00% with bounded retry, then exposed the same runtime story through live review, trace observability, and regression-gate surfaces.</w:t>
+        <w:t>Improved StagePilot benchmark success from 29.17% baseline to 87.50% with parser recovery, and to 100.00% on the current checked-in 24-case benchmark with bounded retry, then exposed the same runtime story through live review, trace observability, and regression-gate surfaces.</w:t>
       </w:r>
     </w:p>
     <w:p>
@@ -315,7 +315,7 @@
         <w:pStyle w:val="ListBullet"/>
       </w:pPr>
       <w:r>
-        <w:t>Improved checked-in benchmark success from 29.17% to 87.50% and 100.00% with bounded retry and reviewable proof surfaces.</w:t>
+        <w:t>Improved checked-in 24-case benchmark success from 29.17% to 87.50%, and to 100.00% with bounded retry on the current snapshot and reviewable proof surfaces.</w:t>
       </w:r>
     </w:p>
     <w:p>
@@ -439,7 +439,7 @@
         <w:rPr>
           <w:b/>
         </w:rPr>
-        <w:t>FabTwin Guardian | Applied High-Trust Operations Case Study</w:t>
+        <w:t>Applied Ops Archive | Archived High-Trust Operations Case Study</w:t>
       </w:r>
     </w:p>
     <w:p>

</xml_diff>

<commit_message>
Update resume and project descriptions
</commit_message>
<xml_diff>
--- a/public/resume/Doeon_Kim_Resume_LLM_Systems_Engineer.docx
+++ b/public/resume/Doeon_Kim_Resume_LLM_Systems_Engineer.docx
@@ -67,7 +67,7 @@
           <w:rFonts w:ascii="Arial" w:hAnsi="Arial"/>
           <w:sz w:val="18"/>
         </w:rPr>
-        <w:t>Improved StagePilot benchmark success from 29.17% baseline to 87.50% with parser recovery and to 100.00% with bounded retry, then exposed the same runtime story through live review, trace observability, and regression-gate surfaces.</w:t>
+        <w:t>Improved StagePilot benchmark success from 29.17% baseline to 87.50% with parser recovery, and to 100.00% on the current checked-in 24-case benchmark with bounded retry, then exposed the same runtime story through live review, trace observability, and regression-gate surfaces.</w:t>
       </w:r>
     </w:p>
     <w:p>
@@ -315,7 +315,7 @@
         <w:pStyle w:val="ListBullet"/>
       </w:pPr>
       <w:r>
-        <w:t>Improved checked-in benchmark success from 29.17% to 87.50% and 100.00% with bounded retry and reviewable proof surfaces.</w:t>
+        <w:t>Improved checked-in 24-case benchmark success from 29.17% to 87.50%, and to 100.00% with bounded retry on the current snapshot and reviewable proof surfaces.</w:t>
       </w:r>
     </w:p>
     <w:p>
@@ -439,7 +439,7 @@
         <w:rPr>
           <w:b/>
         </w:rPr>
-        <w:t>FabTwin Guardian | Applied High-Trust Operations Case Study</w:t>
+        <w:t>Applied Ops Archive | Archived High-Trust Operations Case Study</w:t>
       </w:r>
     </w:p>
     <w:p>

</xml_diff>

<commit_message>
Refine recruiter proof surfaces and application packets
</commit_message>
<xml_diff>
--- a/public/resume/Doeon_Kim_Resume_LLM_Systems_Engineer.docx
+++ b/public/resume/Doeon_Kim_Resume_LLM_Systems_Engineer.docx
@@ -55,7 +55,7 @@
           <w:rFonts w:ascii="Arial" w:hAnsi="Arial"/>
           <w:sz w:val="18"/>
         </w:rPr>
-        <w:t>Builds production-minded AI systems with strongest public proof in tool-calling reliability, multimodal incident workflows, and reviewable runtime design.</w:t>
+        <w:t>Builds production-minded AI systems with strongest public proof in tool-calling reliability, multimodal incident workflows, governed analytics, and reviewable runtime design.</w:t>
       </w:r>
     </w:p>
     <w:p>
@@ -67,7 +67,7 @@
           <w:rFonts w:ascii="Arial" w:hAnsi="Arial"/>
           <w:sz w:val="18"/>
         </w:rPr>
-        <w:t>Improved StagePilot benchmark success from 29.17% baseline to 87.50% with parser recovery, and to 100.00% on the current checked-in 24-case benchmark with bounded retry, then exposed the same runtime story through live review, trace observability, and regression-gate surfaces.</w:t>
+        <w:t>Improved StagePilot benchmark success from 25% baseline to 90% on a 40-case expanded suite (13 edge cases including adversarial, unicode, oversized payloads) with parser recovery and bounded retry, then exposed the same runtime story through public npm delivery, live review, OpenTelemetry traces, and regression-gate surfaces.</w:t>
       </w:r>
     </w:p>
     <w:p>
@@ -79,7 +79,7 @@
           <w:rFonts w:ascii="Arial" w:hAnsi="Arial"/>
           <w:sz w:val="18"/>
         </w:rPr>
-        <w:t>Extends the same reliability posture into bounded live reviewer APIs for incident review, governed analytics, document QA, air-gapped operations, and high-trust workflow delivery.</w:t>
+        <w:t>Extends the same reliability posture into bounded live reviewer APIs for incident review, enterprise governance, warehouse-aware analytics, and high-trust workflow delivery while keeping private customer-style workbenches out of the primary public claim set.</w:t>
       </w:r>
     </w:p>
     <w:p>
@@ -307,7 +307,7 @@
         <w:pStyle w:val="ListBullet"/>
       </w:pPr>
       <w:r>
-        <w:t>Built the canonical repo for parser middleware, StagePilot orchestration, and BenchLab eval tooling.</w:t>
+        <w:t>Built the primary repo for parser middleware, StagePilot orchestration, and BenchLab eval tooling.</w:t>
       </w:r>
     </w:p>
     <w:p>
@@ -315,7 +315,7 @@
         <w:pStyle w:val="ListBullet"/>
       </w:pPr>
       <w:r>
-        <w:t>Improved checked-in 24-case benchmark success from 29.17% to 87.50%, and to 100.00% with bounded retry on the current snapshot and reviewable proof surfaces.</w:t>
+        <w:t>Improved 40-case expanded benchmark (13 edge cases: adversarial, unicode, oversized payloads) from 25% to 90% with middleware and bounded retry, with reviewable project pages.</w:t>
       </w:r>
     </w:p>
     <w:p>
@@ -487,7 +487,7 @@
         <w:pStyle w:val="ResumeBody"/>
       </w:pPr>
       <w:r>
-        <w:t>AI-900, SnowPro Associate, Palantir Foundry Data Engineer Associate, Databricks Platform Architect (AWS/GCP), Datadog Observability</w:t>
+        <w:t>AI-900, SnowPro Associate, Palantir Foundry Data Engineer Associate, Databricks Platform Architect (AWS/GCP), Datadog Observability — issuer validation shared on request or in the application packet</w:t>
       </w:r>
     </w:p>
     <w:p>

</xml_diff>

<commit_message>
Add ops review paths and clean public verification links
</commit_message>
<xml_diff>
--- a/public/resume/Doeon_Kim_Resume_LLM_Systems_Engineer.docx
+++ b/public/resume/Doeon_Kim_Resume_LLM_Systems_Engineer.docx
@@ -221,7 +221,7 @@
         <w:pStyle w:val="ListBullet"/>
       </w:pPr>
       <w:r>
-        <w:t>Shipped customer-facing Node.js, Express, MongoDB, HTML/CSS/JavaScript product features and integrated OpenAI-powered chatbot workflows.</w:t>
+        <w:t>Shipped customer-facing Node.js, Express, MongoDB, HTML/CSS/JavaScript product features and integrated OpenAI-powered chatbot workflows into the existing review platform.</w:t>
       </w:r>
     </w:p>
     <w:p>
@@ -229,7 +229,15 @@
         <w:pStyle w:val="ListBullet"/>
       </w:pPr>
       <w:r>
-        <w:t>Collaborated asynchronously across US time zones to keep feature delivery stable across frontend, backend, and AI integration boundaries.</w:t>
+        <w:t>Improved delivery reliability by tightening server-side configuration, credential handling, request/response error paths, and external API integration flows.</w:t>
+      </w:r>
+    </w:p>
+    <w:p>
+      <w:pPr>
+        <w:pStyle w:val="ListBullet"/>
+      </w:pPr>
+      <w:r>
+        <w:t>Diagnosed log-based integration issues and collaborated asynchronously across US time zones to keep frontend, backend, and AI delivery moving.</w:t>
       </w:r>
     </w:p>
     <w:p>

</xml_diff>